<commit_message>
GameHub : séance devient module, note sur public en G.5
</commit_message>
<xml_diff>
--- a/_documents/GameHub_enonces.docx
+++ b/_documents/GameHub_enonces.docx
@@ -75,14 +75,9 @@
       </w:r>
     </w:p>
     <w:p>
-      <w:pPr>
-        <w:sectPr>
-          <w:pgSz w:w="11906" w:h="16838" w:orient="portrait"/>
-          <w:pgMar w:top="1440" w:right="1440" w:bottom="1440" w:left="1440" w:header="708" w:footer="708" w:gutter="0"/>
-          <w:pgNumType/>
-          <w:docGrid w:linePitch="360"/>
-        </w:sectPr>
-      </w:pPr>
+      <w:r>
+        <w:br w:type="page"/>
+      </w:r>
     </w:p>
     <w:p>
       <w:pPr>
@@ -131,7 +126,7 @@
           <w:sz w:val="22"/>
           <w:szCs w:val="22"/>
         </w:rPr>
-        <w:t xml:space="preserve">et non thématique comme celle des exercices : ici l'ordre est imposé par les dépendances. On ne peut pas écrire </w:t>
+        <w:t xml:space="preserve">et non thématique comme celle des exercices : ici l'ordre est imposé par les dépendances. On ne peut pas écrire </w:t>
       </w:r>
       <w:r>
         <w:rPr>
@@ -175,7 +170,7 @@
           <w:sz w:val="22"/>
           <w:szCs w:val="22"/>
         </w:rPr>
-        <w:t xml:space="preserve">Le projet est le vôtre : vous le construisez dans votre propre dossier, et non dans le recueil d'exercices.</w:t>
+        <w:t xml:space="preserve">Le projet est le vôtre : vous le construisez dans votre propre dossier, et non dans le recueil d'exercices.</w:t>
       </w:r>
     </w:p>
     <w:p>
@@ -301,7 +296,7 @@
           <w:sz w:val="22"/>
           <w:szCs w:val="22"/>
         </w:rPr>
-        <w:t xml:space="preserve">Chaque incrément met en œuvre ce que vous venez de voir en cours, mais dans un programme qui existe déjà. C'est la différence essentielle avec les exercices : il faut faire entrer une idée neuve dans du code écrit avant elle.</w:t>
+        <w:t xml:space="preserve">Chaque incrément met en œuvre ce que vous venez de voir en cours, mais dans un programme qui existe déjà. C'est la différence essentielle avec les exercices : il faut faire entrer une idée neuve dans du code écrit avant elle.</w:t>
       </w:r>
     </w:p>
     <w:tbl>
@@ -736,7 +731,7 @@
                 <w:sz w:val="20"/>
                 <w:szCs w:val="20"/>
               </w:rPr>
-              <w:t xml:space="preserve">héritage bien placé : deux jeux de grille, un seul algorithme</w:t>
+              <w:t xml:space="preserve">héritage bien placé : deux jeux de grille, un seul algorithme</w:t>
             </w:r>
           </w:p>
         </w:tc>
@@ -788,7 +783,7 @@
                 <w:sz w:val="20"/>
                 <w:szCs w:val="20"/>
               </w:rPr>
-              <w:t xml:space="preserve">généricité et lambdas : une paire qui a un sens, une fabrique sans switch</w:t>
+              <w:t xml:space="preserve">généricité et lambdas : une paire qui a un sens, une fabrique sans switch</w:t>
             </w:r>
           </w:p>
         </w:tc>
@@ -840,7 +835,7 @@
                 <w:sz w:val="20"/>
                 <w:szCs w:val="20"/>
               </w:rPr>
-              <w:t xml:space="preserve">JavaFX : le Nim dans une fenêtre, puis des boutons liés à la pile</w:t>
+              <w:t xml:space="preserve">JavaFX : le Nim dans une fenêtre, puis des boutons liés à la pile</w:t>
             </w:r>
           </w:p>
         </w:tc>
@@ -892,7 +887,7 @@
                 <w:sz w:val="20"/>
                 <w:szCs w:val="20"/>
               </w:rPr>
-              <w:t xml:space="preserve">fichiers : un journal qui survit à l'arrêt du programme</w:t>
+              <w:t xml:space="preserve">fichiers : un journal qui survit à l'arrêt du programme</w:t>
             </w:r>
           </w:p>
         </w:tc>
@@ -967,7 +962,7 @@
           <w:sz w:val="22"/>
           <w:szCs w:val="22"/>
         </w:rPr>
-        <w:t xml:space="preserve">Écrivez une classe Joueur. Un joueur a un pseudo et un email, tous deux immuables et fournis au constructeur. Elle présente getPseudo, getEmail, et un toString au format :</w:t>
+        <w:t xml:space="preserve">Écrivez une classe Joueur. Un joueur a un pseudo et un email, tous deux immuables et fournis au constructeur. Elle présente getPseudo, getEmail, et un toString au format :</w:t>
       </w:r>
     </w:p>
     <w:p>
@@ -1002,14 +997,14 @@
           <w:sz w:val="22"/>
           <w:szCs w:val="22"/>
         </w:rPr>
-        <w:t xml:space="preserve">À se demander : </w:t>
-      </w:r>
-      <w:r>
-        <w:rPr>
-          <w:sz w:val="22"/>
-          <w:szCs w:val="22"/>
-        </w:rPr>
-        <w:t xml:space="preserve">quel mot-clé fait respecter l'immuabilité par le compilateur plutôt que par votre vigilance ?</w:t>
+        <w:t xml:space="preserve">À se demander : </w:t>
+      </w:r>
+      <w:r>
+        <w:rPr>
+          <w:sz w:val="22"/>
+          <w:szCs w:val="22"/>
+        </w:rPr>
+        <w:t xml:space="preserve">quel mot-clé fait respecter l'immuabilité par le compilateur plutôt que par votre vigilance ?</w:t>
       </w:r>
     </w:p>
     <w:p>
@@ -1047,7 +1042,7 @@
           <w:sz w:val="22"/>
           <w:szCs w:val="22"/>
         </w:rPr>
-        <w:t xml:space="preserve">Écrivez une classe Partie, vide pour l'instant, qui modélise une partie entre deux joueurs — deux champs. Son constructeur reçoit les deux Joueur, et son toString rend :</w:t>
+        <w:t xml:space="preserve">Écrivez une classe Partie, vide pour l'instant, qui modélise une partie entre deux joueurs — deux champs. Son constructeur reçoit les deux Joueur, et son toString rend :</w:t>
       </w:r>
     </w:p>
     <w:p>
@@ -1113,7 +1108,7 @@
           <w:sz w:val="22"/>
           <w:szCs w:val="22"/>
         </w:rPr>
-        <w:t xml:space="preserve">Écrivez une classe GameHub avec une méthode main : elle crée deux joueurs en demandant pseudo et email au Scanner, puis génère une partie entre eux.</w:t>
+        <w:t xml:space="preserve">Écrivez une classe GameHub avec une méthode main : elle crée deux joueurs en demandant pseudo et email au Scanner, puis génère une partie entre eux.</w:t>
       </w:r>
     </w:p>
     <w:p>
@@ -1175,7 +1170,7 @@
           <w:sz w:val="17"/>
           <w:szCs w:val="17"/>
         </w:rPr>
-        <w:t xml:space="preserve">En vert, les classes ajoutées. Une Partie connaît deux Joueur ; GameHub crée l'une et les autres.</w:t>
+        <w:t xml:space="preserve">En vert, les classes ajoutées. Une Partie connaît deux Joueur ; GameHub crée l'une et les autres.</w:t>
       </w:r>
     </w:p>
     <w:p>
@@ -1277,7 +1272,7 @@
           <w:sz w:val="22"/>
           <w:szCs w:val="22"/>
         </w:rPr>
-        <w:t xml:space="preserve"> ; la fin par une méthode </w:t>
+        <w:t xml:space="preserve"> ; la fin par une méthode </w:t>
       </w:r>
       <w:r>
         <w:rPr>
@@ -1312,14 +1307,14 @@
           <w:sz w:val="22"/>
           <w:szCs w:val="22"/>
         </w:rPr>
-        <w:t xml:space="preserve">À se demander : </w:t>
-      </w:r>
-      <w:r>
-        <w:rPr>
-          <w:sz w:val="22"/>
-          <w:szCs w:val="22"/>
-        </w:rPr>
-        <w:t xml:space="preserve">en prenant la date dans le constructeur, existe-t-il un instant où une Partie serait sans date de début ? Est-ce souhaitable ?</w:t>
+        <w:t xml:space="preserve">À se demander : </w:t>
+      </w:r>
+      <w:r>
+        <w:rPr>
+          <w:sz w:val="22"/>
+          <w:szCs w:val="22"/>
+        </w:rPr>
+        <w:t xml:space="preserve">en prenant la date dans le constructeur, existe-t-il un instant où une Partie serait sans date de début ? Est-ce souhaitable ?</w:t>
       </w:r>
     </w:p>
     <w:p>
@@ -1357,7 +1352,7 @@
           <w:sz w:val="22"/>
           <w:szCs w:val="22"/>
         </w:rPr>
-        <w:t xml:space="preserve">Structurez le projet : be.ephec.gamehub pour le hub, be.ephec.gamehub.modele pour Joueur et Partie. Service et interface utilisateur viendront plus tard.</w:t>
+        <w:t xml:space="preserve">Structurez le projet : be.ephec.gamehub pour le hub, be.ephec.gamehub.modele pour Joueur et Partie. Service et interface utilisateur viendront plus tard.</w:t>
       </w:r>
     </w:p>
     <w:p>
@@ -1385,7 +1380,7 @@
           <w:sz w:val="22"/>
           <w:szCs w:val="22"/>
         </w:rPr>
-        <w:t xml:space="preserve"> plutôt qu'à la main : IntelliJ déplacera les fichiers, ajoutera les instructions </w:t>
+        <w:t xml:space="preserve"> plutôt qu'à la main : IntelliJ déplacera les fichiers, ajoutera les instructions </w:t>
       </w:r>
       <w:r>
         <w:rPr>
@@ -1418,6 +1413,66 @@
           <w:szCs w:val="22"/>
         </w:rPr>
         <w:t xml:space="preserve"> du guide.</w:t>
+      </w:r>
+    </w:p>
+    <w:p>
+      <w:pPr>
+        <w:spacing w:after="120"/>
+      </w:pPr>
+      <w:r>
+        <w:rPr>
+          <w:sz w:val="22"/>
+          <w:szCs w:val="22"/>
+        </w:rPr>
+        <w:t xml:space="preserve">Le module </w:t>
+      </w:r>
+      <w:r>
+        <w:rPr>
+          <w:rFonts w:ascii="Consolas" w:cs="Consolas" w:eastAsia="Consolas" w:hAnsi="Consolas"/>
+          <w:color w:val="8B2500"/>
+          <w:sz w:val="22"/>
+          <w:szCs w:val="22"/>
+        </w:rPr>
+        <w:t xml:space="preserve">PKG</w:t>
+      </w:r>
+      <w:r>
+        <w:rPr>
+          <w:sz w:val="22"/>
+          <w:szCs w:val="22"/>
+        </w:rPr>
+        <w:t xml:space="preserve"> viendra plus tard, et ce déplacement n'en demande qu'une chose : une classe utilisée depuis un autre package doit être </w:t>
+      </w:r>
+      <w:r>
+        <w:rPr>
+          <w:rFonts w:ascii="Consolas" w:cs="Consolas" w:eastAsia="Consolas" w:hAnsi="Consolas"/>
+          <w:color w:val="8B2500"/>
+          <w:sz w:val="22"/>
+          <w:szCs w:val="22"/>
+        </w:rPr>
+        <w:t xml:space="preserve">public</w:t>
+      </w:r>
+      <w:r>
+        <w:rPr>
+          <w:sz w:val="22"/>
+          <w:szCs w:val="22"/>
+        </w:rPr>
+        <w:t xml:space="preserve">, ainsi que son constructeur et les méthodes qu'on y appelle. Si IntelliJ signale après le déplacement qu'un élément « n'est pas public », ajoutez ce mot ; </w:t>
+      </w:r>
+      <w:r>
+        <w:rPr>
+          <w:rFonts w:ascii="Consolas" w:cs="Consolas" w:eastAsia="Consolas" w:hAnsi="Consolas"/>
+          <w:color w:val="8B2500"/>
+          <w:sz w:val="22"/>
+          <w:szCs w:val="22"/>
+        </w:rPr>
+        <w:t xml:space="preserve">PKG</w:t>
+      </w:r>
+      <w:r>
+        <w:rPr>
+          <w:sz w:val="22"/>
+          <w:szCs w:val="22"/>
+        </w:rPr>
+        <w:t xml:space="preserve"> expliquera pourquoi.</w:t>
       </w:r>
     </w:p>
     <w:p>
@@ -1479,7 +1534,7 @@
           <w:sz w:val="17"/>
           <w:szCs w:val="17"/>
         </w:rPr>
-        <w:t xml:space="preserve">Deux packages. Les flèches en pointillé se lisent « dépend de ».</w:t>
+        <w:t xml:space="preserve">Deux packages. Les flèches en pointillé se lisent « dépend de ».</w:t>
       </w:r>
     </w:p>
     <w:p>
@@ -1545,7 +1600,7 @@
           <w:sz w:val="22"/>
           <w:szCs w:val="22"/>
         </w:rPr>
-        <w:t xml:space="preserve"> et d'un toString pour être affichable dans un menu : </w:t>
+        <w:t xml:space="preserve"> et d'un toString pour être affichable dans un menu : </w:t>
       </w:r>
       <w:r>
         <w:rPr>
@@ -1580,14 +1635,14 @@
           <w:sz w:val="22"/>
           <w:szCs w:val="22"/>
         </w:rPr>
-        <w:t xml:space="preserve">À se demander : </w:t>
-      </w:r>
-      <w:r>
-        <w:rPr>
-          <w:sz w:val="22"/>
-          <w:szCs w:val="22"/>
-        </w:rPr>
-        <w:t xml:space="preserve">dans quelle classe ces deux énumérations vont-elles servir ?</w:t>
+        <w:t xml:space="preserve">À se demander : </w:t>
+      </w:r>
+      <w:r>
+        <w:rPr>
+          <w:sz w:val="22"/>
+          <w:szCs w:val="22"/>
+        </w:rPr>
+        <w:t xml:space="preserve">dans quelle classe ces deux énumérations vont-elles servir ?</w:t>
       </w:r>
     </w:p>
     <w:p>
@@ -1641,7 +1696,7 @@
           <w:sz w:val="22"/>
           <w:szCs w:val="22"/>
         </w:rPr>
-        <w:t xml:space="preserve"> qui reçoit le résultat et l'enregistre. Ajoutez les accesseurs, et complétez le toString :</w:t>
+        <w:t xml:space="preserve"> qui reçoit le résultat et l'enregistre. Ajoutez les accesseurs, et complétez le toString :</w:t>
       </w:r>
     </w:p>
     <w:p>
@@ -1689,7 +1744,7 @@
           <w:sz w:val="19"/>
           <w:szCs w:val="19"/>
         </w:rPr>
-        <w:t xml:space="preserve">    + (resultat != null ? " - resultat : " + resultat : "")</w:t>
+        <w:t xml:space="preserve">    + (resultat != null ? " - resultat : " + resultat : "")</w:t>
       </w:r>
     </w:p>
     <w:p>
@@ -1746,14 +1801,14 @@
           <w:sz w:val="22"/>
           <w:szCs w:val="22"/>
         </w:rPr>
-        <w:t xml:space="preserve">À se demander : </w:t>
-      </w:r>
-      <w:r>
-        <w:rPr>
-          <w:sz w:val="22"/>
-          <w:szCs w:val="22"/>
-        </w:rPr>
-        <w:t xml:space="preserve">à quel endroit ce record peut-il se créer ? Dans quelle classe, et dans quelle méthode ? Cherchez le seul moment où toutes ses données existent en même temps.</w:t>
+        <w:t xml:space="preserve">À se demander : </w:t>
+      </w:r>
+      <w:r>
+        <w:rPr>
+          <w:sz w:val="22"/>
+          <w:szCs w:val="22"/>
+        </w:rPr>
+        <w:t xml:space="preserve">à quel endroit ce record peut-il se créer ? Dans quelle classe, et dans quelle méthode ? Cherchez le seul moment où toutes ses données existent en même temps.</w:t>
       </w:r>
     </w:p>
     <w:p>
@@ -1791,7 +1846,7 @@
           <w:sz w:val="22"/>
           <w:szCs w:val="22"/>
         </w:rPr>
-        <w:t xml:space="preserve">Modifiez GameHub : ajoutez le choix du type de jeu en affichant les valeurs de TypeJeu, créez une partie et affichez-la, terminez-la et affichez-la à nouveau.</w:t>
+        <w:t xml:space="preserve">Modifiez GameHub : ajoutez le choix du type de jeu en affichant les valeurs de TypeJeu, créez une partie et affichez-la, terminez-la et affichez-la à nouveau.</w:t>
       </w:r>
     </w:p>
     <w:p>
@@ -1810,7 +1865,7 @@
           <w:sz w:val="22"/>
           <w:szCs w:val="22"/>
         </w:rPr>
-        <w:t xml:space="preserve">À se demander : </w:t>
+        <w:t xml:space="preserve">À se demander : </w:t>
       </w:r>
       <w:r>
         <w:rPr>
@@ -1833,7 +1888,7 @@
           <w:sz w:val="22"/>
           <w:szCs w:val="22"/>
         </w:rPr>
-        <w:t xml:space="preserve">. Que se passe-t-il alors le jour où vous ajoutez un jeu au catalogue ?</w:t>
+        <w:t xml:space="preserve">. Que se passe-t-il alors le jour où vous ajoutez un jeu au catalogue ?</w:t>
       </w:r>
     </w:p>
     <w:p>
@@ -1895,7 +1950,7 @@
           <w:sz w:val="17"/>
           <w:szCs w:val="17"/>
         </w:rPr>
-        <w:t xml:space="preserve">L'état du modèle à la fin de la première partie. Partie est devenue le centre : elle connaît tout le reste.</w:t>
+        <w:t xml:space="preserve">L'état du modèle à la fin de la première partie. Partie est devenue le centre : elle connaît tout le reste.</w:t>
       </w:r>
     </w:p>
     <w:p>
@@ -2059,7 +2114,7 @@
                 <w:sz w:val="22"/>
                 <w:szCs w:val="22"/>
               </w:rPr>
-              <w:t xml:space="preserve">La conception retenue ici — une classe abstraite, une méthode jouer() sans paramètre ni résultat — sera remplacée dès la séance suivante par une interface Jeu de signature différente.</w:t>
+              <w:t xml:space="preserve">La conception retenue ici — une classe abstraite, une méthode jouer() sans paramètre ni résultat — sera remplacée dès le module suivant, ITF, par une interface Jeu de signature différente.</w:t>
             </w:r>
           </w:p>
           <w:p>
@@ -2071,7 +2126,7 @@
                 <w:sz w:val="22"/>
                 <w:szCs w:val="22"/>
               </w:rPr>
-              <w:t xml:space="preserve">Ce n'est pas un accident de parcours : c'est la vie normale d'une conception. Faites-le quand même, et gardez-en le souvenir. La comparaison des deux vaut plus que l'une des deux.</w:t>
+              <w:t xml:space="preserve">Ce n'est pas un accident de parcours : c'est la vie normale d'une conception. Faites-le quand même, et gardez-en le souvenir. La comparaison des deux vaut plus que l'une des deux.</w:t>
             </w:r>
           </w:p>
         </w:tc>
@@ -2128,7 +2183,7 @@
           <w:sz w:val="22"/>
           <w:szCs w:val="22"/>
         </w:rPr>
-        <w:t xml:space="preserve"> avec trois méthodes : </w:t>
+        <w:t xml:space="preserve"> avec trois méthodes : </w:t>
       </w:r>
       <w:r>
         <w:rPr>
@@ -2214,7 +2269,7 @@
           <w:sz w:val="22"/>
           <w:szCs w:val="22"/>
         </w:rPr>
-        <w:t xml:space="preserve">Modifiez Partie pour qu'elle enregistre des observateurs :</w:t>
+        <w:t xml:space="preserve">Modifiez Partie pour qu'elle enregistre des observateurs :</w:t>
       </w:r>
     </w:p>
     <w:p>
@@ -2231,7 +2286,7 @@
           <w:sz w:val="22"/>
           <w:szCs w:val="22"/>
         </w:rPr>
-        <w:t xml:space="preserve">une liste d'observateurs ;</w:t>
+        <w:t xml:space="preserve">une liste d'observateurs ;</w:t>
       </w:r>
     </w:p>
     <w:p>
@@ -2248,7 +2303,7 @@
           <w:sz w:val="22"/>
           <w:szCs w:val="22"/>
         </w:rPr>
-        <w:t xml:space="preserve">des méthodes ajouterObservateur et retirerObservateur ;</w:t>
+        <w:t xml:space="preserve">des méthodes ajouterObservateur et retirerObservateur ;</w:t>
       </w:r>
     </w:p>
     <w:p>
@@ -2265,7 +2320,7 @@
           <w:sz w:val="22"/>
           <w:szCs w:val="22"/>
         </w:rPr>
-        <w:t xml:space="preserve">des méthodes privées notifierDebut, notifierCoup et notifierFin, qui parcourent la liste ;</w:t>
+        <w:t xml:space="preserve">des méthodes privées notifierDebut, notifierCoup et notifierFin, qui parcourent la liste ;</w:t>
       </w:r>
     </w:p>
     <w:p>
@@ -2338,7 +2393,7 @@
                 <w:sz w:val="22"/>
                 <w:szCs w:val="22"/>
               </w:rPr>
-              <w:t xml:space="preserve">Les observateurs s'ajoutent après la construction de la Partie. Que voit donc l'observateur quand notifierDebut est appelé depuis le constructeur ?</w:t>
+              <w:t xml:space="preserve">Les observateurs s'ajoutent après la construction de la Partie. Que voit donc l'observateur quand notifierDebut est appelé depuis le constructeur ?</w:t>
             </w:r>
           </w:p>
           <w:p>
@@ -2410,14 +2465,14 @@
           <w:sz w:val="22"/>
           <w:szCs w:val="22"/>
         </w:rPr>
-        <w:t xml:space="preserve">À se demander : </w:t>
-      </w:r>
-      <w:r>
-        <w:rPr>
-          <w:sz w:val="22"/>
-          <w:szCs w:val="22"/>
-        </w:rPr>
-        <w:t xml:space="preserve">cet observateur pourrait-il écrire dans un fichier au lieu de la console ? Combien de lignes de Partie faudrait-il changer ?</w:t>
+        <w:t xml:space="preserve">À se demander : </w:t>
+      </w:r>
+      <w:r>
+        <w:rPr>
+          <w:sz w:val="22"/>
+          <w:szCs w:val="22"/>
+        </w:rPr>
+        <w:t xml:space="preserve">cet observateur pourrait-il écrire dans un fichier au lieu de la console ? Combien de lignes de Partie faudrait-il changer ?</w:t>
       </w:r>
     </w:p>
     <w:p>
@@ -2513,7 +2568,7 @@
           <w:sz w:val="22"/>
           <w:szCs w:val="22"/>
         </w:rPr>
-        <w:t xml:space="preserve">Sept incréments pour que GameHub cesse de connaître les jeux qu'il lance. C'est le passage le plus important du fil rouge : à sa fin, ajouter un jeu ne demandera plus une seule ligne dans le hub.</w:t>
+        <w:t xml:space="preserve">Sept incréments pour que GameHub cesse de connaître les jeux qu'il lance. C'est le passage le plus important du fil rouge : à sa fin, ajouter un jeu ne demandera plus une seule ligne dans le hub.</w:t>
       </w:r>
     </w:p>
     <w:p>
@@ -2599,7 +2654,7 @@
           <w:sz w:val="22"/>
           <w:szCs w:val="22"/>
         </w:rPr>
-        <w:t xml:space="preserve"> :</w:t>
+        <w:t xml:space="preserve"> :</w:t>
       </w:r>
     </w:p>
     <w:p>
@@ -2731,7 +2786,7 @@
                 <w:sz w:val="22"/>
                 <w:szCs w:val="22"/>
               </w:rPr>
-              <w:t xml:space="preserve">Ici le jeu reçoit deux joueurs et rend un résultat. Il ne connaît plus la Partie du tout : c'est le hub qui fait le lien. Chacun retrouve une seule responsabilité.</w:t>
+              <w:t xml:space="preserve">Ici le jeu reçoit deux joueurs et rend un résultat. Il ne connaît plus la Partie du tout : c'est le hub qui fait le lien. Chacun retrouve une seule responsabilité.</w:t>
             </w:r>
           </w:p>
           <w:p>
@@ -2765,14 +2820,14 @@
           <w:sz w:val="22"/>
           <w:szCs w:val="22"/>
         </w:rPr>
-        <w:t xml:space="preserve">À se demander : </w:t>
-      </w:r>
-      <w:r>
-        <w:rPr>
-          <w:sz w:val="22"/>
-          <w:szCs w:val="22"/>
-        </w:rPr>
-        <w:t xml:space="preserve">l'interface ne déclare aucun champ, là où la classe abstraite en imposait un. Qu'est-ce que cela change pour celui qui écrit un jeu ?</w:t>
+        <w:t xml:space="preserve">À se demander : </w:t>
+      </w:r>
+      <w:r>
+        <w:rPr>
+          <w:sz w:val="22"/>
+          <w:szCs w:val="22"/>
+        </w:rPr>
+        <w:t xml:space="preserve">l'interface ne déclare aucun champ, là où la classe abstraite en imposait un. Qu'est-ce que cela change pour celui qui écrit un jeu ?</w:t>
       </w:r>
     </w:p>
     <w:p>
@@ -2826,7 +2881,7 @@
           <w:sz w:val="22"/>
           <w:szCs w:val="22"/>
         </w:rPr>
-        <w:t xml:space="preserve">, avec une seule méthode :</w:t>
+        <w:t xml:space="preserve">, avec une seule méthode :</w:t>
       </w:r>
     </w:p>
     <w:p>
@@ -2854,7 +2909,7 @@
           <w:sz w:val="22"/>
           <w:szCs w:val="22"/>
         </w:rPr>
-        <w:t xml:space="preserve">Elle rend l'implémentation correspondant au type demandé. Pour l'instant, aucun jeu n'existe : levez une exception explicite pour les types non implémentés.</w:t>
+        <w:t xml:space="preserve">Elle rend l'implémentation correspondant au type demandé. Pour l'instant, aucun jeu n'existe : levez une exception explicite pour les types non implémentés.</w:t>
       </w:r>
     </w:p>
     <w:p>
@@ -2891,7 +2946,7 @@
           <w:sz w:val="22"/>
           <w:szCs w:val="22"/>
         </w:rPr>
-        <w:t xml:space="preserve">, et déléguera la construction. Vérifiez-le en relisant vos imports : aucune classe concrète de jeu ne doit apparaître dans GameHub.</w:t>
+        <w:t xml:space="preserve">, et déléguera la construction. Vérifiez-le en relisant vos imports : aucune classe concrète de jeu ne doit apparaître dans GameHub.</w:t>
       </w:r>
     </w:p>
     <w:p>
@@ -2910,14 +2965,14 @@
           <w:sz w:val="22"/>
           <w:szCs w:val="22"/>
         </w:rPr>
-        <w:t xml:space="preserve">À se demander : </w:t>
-      </w:r>
-      <w:r>
-        <w:rPr>
-          <w:sz w:val="22"/>
-          <w:szCs w:val="22"/>
-        </w:rPr>
-        <w:t xml:space="preserve">cette fabrique est le seul endroit du programme qui connaisse toutes les classes de jeux. Est-ce un défaut ou une qualité ?</w:t>
+        <w:t xml:space="preserve">À se demander : </w:t>
+      </w:r>
+      <w:r>
+        <w:rPr>
+          <w:sz w:val="22"/>
+          <w:szCs w:val="22"/>
+        </w:rPr>
+        <w:t xml:space="preserve">cette fabrique est le seul endroit du programme qui connaisse toutes les classes de jeux. Est-ce un défaut ou une qualité ?</w:t>
       </w:r>
     </w:p>
     <w:p>
@@ -3278,7 +3333,7 @@
           <w:sz w:val="22"/>
           <w:szCs w:val="22"/>
         </w:rPr>
-        <w:t xml:space="preserve">La règle du jeu : </w:t>
+        <w:t xml:space="preserve">La règle du jeu : </w:t>
       </w:r>
       <w:r>
         <w:rPr>
@@ -3320,7 +3375,7 @@
           <w:sz w:val="22"/>
           <w:szCs w:val="22"/>
         </w:rPr>
-        <w:t xml:space="preserve">À se demander : </w:t>
+        <w:t xml:space="preserve">À se demander : </w:t>
       </w:r>
       <w:r>
         <w:rPr>
@@ -3343,7 +3398,7 @@
           <w:sz w:val="22"/>
           <w:szCs w:val="22"/>
         </w:rPr>
-        <w:t xml:space="preserve"> sur une pile qui n'en a que trois ? Descendre à −1, ou refuser ? Voir </w:t>
+        <w:t xml:space="preserve"> sur une pile qui n'en a que trois ? Descendre à −1, ou refuser ? Voir </w:t>
       </w:r>
       <w:r>
         <w:rPr>
@@ -3397,7 +3452,7 @@
           <w:sz w:val="22"/>
           <w:szCs w:val="22"/>
         </w:rPr>
-        <w:t xml:space="preserve">Un joueur de Nim doit décider combien d'allumettes retirer. Cette décision est un comportement, et elle change d'un joueur à l'autre : c'est donc une interface.</w:t>
+        <w:t xml:space="preserve">Un joueur de Nim doit décider combien d'allumettes retirer. Cette décision est un comportement, et elle change d'un joueur à l'autre : c'est donc une interface.</w:t>
       </w:r>
     </w:p>
     <w:p>
@@ -3457,7 +3512,7 @@
           <w:sz w:val="22"/>
           <w:szCs w:val="22"/>
         </w:rPr>
-        <w:t xml:space="preserve">Écrivez-la, puis une première implémentation : </w:t>
+        <w:t xml:space="preserve">Écrivez-la, puis une première implémentation : </w:t>
       </w:r>
       <w:r>
         <w:rPr>
@@ -3494,7 +3549,7 @@
           <w:sz w:val="22"/>
           <w:szCs w:val="22"/>
         </w:rPr>
-        <w:t xml:space="preserve">Une stratégie qui supposerait « le maximum est trois » cesserait de fonctionner à la première variante du jeu. Celle-ci demande.</w:t>
+        <w:t xml:space="preserve">Une stratégie qui supposerait « le maximum est trois » cesserait de fonctionner à la première variante du jeu. Celle-ci demande.</w:t>
       </w:r>
     </w:p>
     <w:p>
@@ -3513,14 +3568,14 @@
           <w:sz w:val="22"/>
           <w:szCs w:val="22"/>
         </w:rPr>
-        <w:t xml:space="preserve">À se demander : </w:t>
-      </w:r>
-      <w:r>
-        <w:rPr>
-          <w:sz w:val="22"/>
-          <w:szCs w:val="22"/>
-        </w:rPr>
-        <w:t xml:space="preserve">combien de méthodes cette interface déclare-t-elle ? Quel nom porte ce genre d'interface, et que pourrez-vous en faire au thème </w:t>
+        <w:t xml:space="preserve">À se demander : </w:t>
+      </w:r>
+      <w:r>
+        <w:rPr>
+          <w:sz w:val="22"/>
+          <w:szCs w:val="22"/>
+        </w:rPr>
+        <w:t xml:space="preserve">combien de méthodes cette interface déclare-t-elle ? Quel nom porte ce genre d'interface, et que pourrez-vous en faire au thème </w:t>
       </w:r>
       <w:r>
         <w:rPr>
@@ -3536,7 +3591,7 @@
           <w:sz w:val="22"/>
           <w:szCs w:val="22"/>
         </w:rPr>
-        <w:t xml:space="preserve"> ?</w:t>
+        <w:t xml:space="preserve"> ?</w:t>
       </w:r>
     </w:p>
     <w:p>
@@ -3606,7 +3661,7 @@
           <w:sz w:val="22"/>
           <w:szCs w:val="22"/>
         </w:rPr>
-        <w:t xml:space="preserve">. Son constructeur reçoit le nombre d'allumettes initiales et les règles ; ses deux joueurs utilisent pour l'instant la stratégie timide.</w:t>
+        <w:t xml:space="preserve">. Son constructeur reçoit le nombre d'allumettes initiales et les règles ; ses deux joueurs utilisent pour l'instant la stratégie timide.</w:t>
       </w:r>
     </w:p>
     <w:p>
@@ -3618,7 +3673,7 @@
           <w:sz w:val="22"/>
           <w:szCs w:val="22"/>
         </w:rPr>
-        <w:t xml:space="preserve">La méthode jouer fait tourner la partie : tant que la pile n'est pas vide, le joueur dont c'est le tour consulte sa stratégie, retire, et la main passe. Celui qui vide la pile a perdu.</w:t>
+        <w:t xml:space="preserve">La méthode jouer fait tourner la partie : tant que la pile n'est pas vide, le joueur dont c'est le tour consulte sa stratégie, retire, et la main passe. Celui qui vide la pile a perdu.</w:t>
       </w:r>
     </w:p>
     <w:p>
@@ -3658,14 +3713,14 @@
           <w:sz w:val="22"/>
           <w:szCs w:val="22"/>
         </w:rPr>
-        <w:t xml:space="preserve">À se demander : </w:t>
-      </w:r>
-      <w:r>
-        <w:rPr>
-          <w:sz w:val="22"/>
-          <w:szCs w:val="22"/>
-        </w:rPr>
-        <w:t xml:space="preserve">que se passe-t-il si une stratégie propose un coup interdit ? Votre jeu doit-il lui faire confiance ?</w:t>
+        <w:t xml:space="preserve">À se demander : </w:t>
+      </w:r>
+      <w:r>
+        <w:rPr>
+          <w:sz w:val="22"/>
+          <w:szCs w:val="22"/>
+        </w:rPr>
+        <w:t xml:space="preserve">que se passe-t-il si une stratégie propose un coup interdit ? Votre jeu doit-il lui faire confiance ?</w:t>
       </w:r>
     </w:p>
     <w:p>
@@ -3698,7 +3753,7 @@
           <w:sz w:val="22"/>
           <w:szCs w:val="22"/>
         </w:rPr>
-        <w:t xml:space="preserve"> dans la fabrique, et lancez une partie depuis le hub. Deux joueurs timides : que se passe-t-il, et est-ce intéressant ?</w:t>
+        <w:t xml:space="preserve"> dans la fabrique, et lancez une partie depuis le hub. Deux joueurs timides : que se passe-t-il, et est-ce intéressant ?</w:t>
       </w:r>
     </w:p>
     <w:p>
@@ -4086,7 +4141,7 @@
                 <w:sz w:val="22"/>
                 <w:szCs w:val="22"/>
               </w:rPr>
-              <w:t xml:space="preserve">Avec un maximum de trois par tour, l'adversaire peut toujours ramener un total de quatre à zéro : quoi qu'il retire, on complète à 4. Les positions perdantes sont donc celles où il reste 1, 5, 9, 13…</w:t>
+              <w:t xml:space="preserve">Avec un maximum de trois par tour, l'adversaire peut toujours ramener un total de quatre à zéro : quoi qu'il retire, on complète à 4. Les positions perdantes sont donc celles où il reste 1, 5, 9, 13…</w:t>
             </w:r>
           </w:p>
           <w:p>
@@ -4120,7 +4175,7 @@
           <w:sz w:val="22"/>
           <w:szCs w:val="22"/>
         </w:rPr>
-        <w:t xml:space="preserve">À se demander : </w:t>
+        <w:t xml:space="preserve">À se demander : </w:t>
       </w:r>
       <w:r>
         <w:rPr>
@@ -4143,7 +4198,7 @@
           <w:sz w:val="22"/>
           <w:szCs w:val="22"/>
         </w:rPr>
-        <w:t xml:space="preserve">, et pourquoi le même motif revient-il un étage plus bas ?</w:t>
+        <w:t xml:space="preserve">, et pourquoi le même motif revient-il un étage plus bas ?</w:t>
       </w:r>
     </w:p>
     <w:p>
@@ -4176,7 +4231,7 @@
           <w:sz w:val="22"/>
           <w:szCs w:val="22"/>
         </w:rPr>
-        <w:t xml:space="preserve">. Une stratégie est une fonction de la pile et des règles vers un nombre : rien n'est plus facile à vérifier en JUnit.</w:t>
+        <w:t xml:space="preserve">. Une stratégie est une fonction de la pile et des règles vers un nombre : rien n'est plus facile à vérifier en JUnit.</w:t>
       </w:r>
     </w:p>
     <w:p>
@@ -4262,7 +4317,7 @@
           <w:sz w:val="22"/>
           <w:szCs w:val="22"/>
         </w:rPr>
-        <w:t xml:space="preserve"> : sa méthode demande à l'utilisateur la stratégie de chaque joueur, et appelle la fabrique.</w:t>
+        <w:t xml:space="preserve"> : sa méthode demande à l'utilisateur la stratégie de chaque joueur, et appelle la fabrique.</w:t>
       </w:r>
     </w:p>
     <w:p>
@@ -4274,7 +4329,7 @@
           <w:sz w:val="22"/>
           <w:szCs w:val="22"/>
         </w:rPr>
-        <w:t xml:space="preserve">Modifiez enfin GameHub : après avoir obtenu un Jeu de la fabrique, il configure celui-ci s'il est configurable.</w:t>
+        <w:t xml:space="preserve">Modifiez enfin GameHub : après avoir obtenu un Jeu de la fabrique, il configure celui-ci s'il est configurable.</w:t>
       </w:r>
     </w:p>
     <w:p>
@@ -4378,7 +4433,7 @@
                 <w:sz w:val="22"/>
                 <w:szCs w:val="22"/>
               </w:rPr>
-              <w:t xml:space="preserve">JeuConfigurable ne décrit pas ce qu'est un jeu : elle signale une capacité optionnelle. Tous les jeux n'ont pas de réglages, et les forcer à écrire une méthode configure() vide serait pire que de les laisser tranquilles.</w:t>
+              <w:t xml:space="preserve">JeuConfigurable ne décrit pas ce qu'est un jeu : elle signale une capacité optionnelle. Tous les jeux n'ont pas de réglages, et les forcer à écrire une méthode configure() vide serait pire que de les laisser tranquilles.</w:t>
             </w:r>
           </w:p>
           <w:p>
@@ -4434,7 +4489,7 @@
           <w:sz w:val="22"/>
           <w:szCs w:val="22"/>
         </w:rPr>
-        <w:t xml:space="preserve">C'est ce que les trois séances précédentes servaient à construire. Les incréments qui suivent vont s'appuyer dessus, puis le mettre en défaut.</w:t>
+        <w:t xml:space="preserve">C'est ce que les modules précédents servaient à construire. Les incréments qui suivent vont s'appuyer dessus, puis le mettre en défaut.</w:t>
       </w:r>
     </w:p>
     <w:p>
@@ -4496,7 +4551,7 @@
           <w:sz w:val="17"/>
           <w:szCs w:val="17"/>
         </w:rPr>
-        <w:t xml:space="preserve">Le jeu de Nim au complet. JeuNim ne connaît aucune stratégie concrète : il en reçoit deux, et les fait travailler.</w:t>
+        <w:t xml:space="preserve">Le jeu de Nim au complet. JeuNim ne connaît aucune stratégie concrète : il en reçoit deux, et les fait travailler.</w:t>
       </w:r>
     </w:p>
     <w:p>
@@ -4530,7 +4585,7 @@
           <w:sz w:val="22"/>
           <w:szCs w:val="22"/>
         </w:rPr>
-        <w:t xml:space="preserve">Ces sept incréments s'appuient sur tout ce qui précède : l'interface Jeu, la fabrique, et JeuNim comme modèle de jeu concret.</w:t>
+        <w:t xml:space="preserve">Ces sept incréments s'appuient sur tout ce qui précède : l'interface Jeu, la fabrique, et JeuNim comme modèle de jeu concret.</w:t>
       </w:r>
     </w:p>
     <w:p>
@@ -4600,7 +4655,7 @@
           <w:sz w:val="22"/>
           <w:szCs w:val="22"/>
         </w:rPr>
-        <w:t xml:space="preserve">. Trois choses changent : le champ </w:t>
+        <w:t xml:space="preserve">. Trois choses changent : le champ </w:t>
       </w:r>
       <w:r>
         <w:rPr>
@@ -4734,7 +4789,7 @@
           <w:sz w:val="22"/>
           <w:szCs w:val="22"/>
         </w:rPr>
-        <w:t xml:space="preserve">, mais dans un ordre différent : la première est DEUX, la dernière AS.</w:t>
+        <w:t xml:space="preserve">, mais dans un ordre différent : la première est DEUX, la dernière AS.</w:t>
       </w:r>
     </w:p>
     <w:p>
@@ -4901,7 +4956,7 @@
           <w:sz w:val="22"/>
           <w:szCs w:val="22"/>
         </w:rPr>
-        <w:t xml:space="preserve">Ajoutez deux méthodes privées pour la lisibilité :</w:t>
+        <w:t xml:space="preserve">Ajoutez deux méthodes privées pour la lisibilité :</w:t>
       </w:r>
     </w:p>
     <w:tbl>
@@ -5117,7 +5172,7 @@
           <w:sz w:val="22"/>
           <w:szCs w:val="22"/>
         </w:rPr>
-        <w:t xml:space="preserve">Attaquez ResultatPartie jouer(Joueur, Joueur), dans sa version sans bataille :</w:t>
+        <w:t xml:space="preserve">Attaquez ResultatPartie jouer(Joueur, Joueur), dans sa version sans bataille :</w:t>
       </w:r>
     </w:p>
     <w:p>
@@ -5134,7 +5189,7 @@
           <w:sz w:val="22"/>
           <w:szCs w:val="22"/>
         </w:rPr>
-        <w:t xml:space="preserve">vérifiez d'abord que les deux Joueur ne sont pas null ;</w:t>
+        <w:t xml:space="preserve">vérifiez d'abord que les deux Joueur ne sont pas null ;</w:t>
       </w:r>
     </w:p>
     <w:p>
@@ -5151,7 +5206,7 @@
           <w:sz w:val="22"/>
           <w:szCs w:val="22"/>
         </w:rPr>
-        <w:t xml:space="preserve">construisez le Deck et mélangez-le ;</w:t>
+        <w:t xml:space="preserve">construisez le Deck et mélangez-le ;</w:t>
       </w:r>
     </w:p>
     <w:p>
@@ -5184,7 +5239,7 @@
           <w:sz w:val="22"/>
           <w:szCs w:val="22"/>
         </w:rPr>
-        <w:t xml:space="preserve"> pour les mains, et remplissez-les par distribuer ;</w:t>
+        <w:t xml:space="preserve"> pour les mains, et remplissez-les par distribuer ;</w:t>
       </w:r>
     </w:p>
     <w:p>
@@ -5255,7 +5310,7 @@
           <w:sz w:val="22"/>
           <w:szCs w:val="22"/>
         </w:rPr>
-        <w:t xml:space="preserve">Initialisez un compteur de tours. Tant qu'aucune pioche n'est vide et que le maximum n'est pas atteint :</w:t>
+        <w:t xml:space="preserve">Initialisez un compteur de tours. Tant qu'aucune pioche n'est vide et que le maximum n'est pas atteint :</w:t>
       </w:r>
     </w:p>
     <w:p>
@@ -5272,7 +5327,7 @@
           <w:sz w:val="22"/>
           <w:szCs w:val="22"/>
         </w:rPr>
-        <w:t xml:space="preserve">incrémentez le tour ;</w:t>
+        <w:t xml:space="preserve">incrémentez le tour ;</w:t>
       </w:r>
     </w:p>
     <w:p>
@@ -5305,7 +5360,7 @@
           <w:sz w:val="22"/>
           <w:szCs w:val="22"/>
         </w:rPr>
-        <w:t xml:space="preserve"> ;</w:t>
+        <w:t xml:space="preserve"> ;</w:t>
       </w:r>
     </w:p>
     <w:p>
@@ -5322,7 +5377,7 @@
           <w:sz w:val="22"/>
           <w:szCs w:val="22"/>
         </w:rPr>
-        <w:t xml:space="preserve">comparez-les ;</w:t>
+        <w:t xml:space="preserve">comparez-les ;</w:t>
       </w:r>
     </w:p>
     <w:p>
@@ -5393,7 +5448,7 @@
           <w:sz w:val="22"/>
           <w:szCs w:val="22"/>
         </w:rPr>
-        <w:t xml:space="preserve">À la sortie de la boucle, déterminez le résultat :</w:t>
+        <w:t xml:space="preserve">À la sortie de la boucle, déterminez le résultat :</w:t>
       </w:r>
     </w:p>
     <w:tbl>
@@ -5690,14 +5745,14 @@
           <w:sz w:val="22"/>
           <w:szCs w:val="22"/>
         </w:rPr>
-        <w:t xml:space="preserve">À se demander : </w:t>
-      </w:r>
-      <w:r>
-        <w:rPr>
-          <w:sz w:val="22"/>
-          <w:szCs w:val="22"/>
-        </w:rPr>
-        <w:t xml:space="preserve">une pioche vide signifie que le joueur a tout perdu. Les deux lignes du milieu vous paraissent-elles cohérentes entre elles ?</w:t>
+        <w:t xml:space="preserve">À se demander : </w:t>
+      </w:r>
+      <w:r>
+        <w:rPr>
+          <w:sz w:val="22"/>
+          <w:szCs w:val="22"/>
+        </w:rPr>
+        <w:t xml:space="preserve">une pioche vide signifie que le joueur a tout perdu. Les deux lignes du milieu vous paraissent-elles cohérentes entre elles ?</w:t>
       </w:r>
     </w:p>
     <w:p>
@@ -5873,7 +5928,7 @@
           <w:sz w:val="17"/>
           <w:szCs w:val="17"/>
         </w:rPr>
-        <w:t xml:space="preserve">JeuBatailleV1 hérite de V0 et ne redéfinit qu'une méthode : tout le reste est commun.</w:t>
+        <w:t xml:space="preserve">JeuBatailleV1 hérite de V0 et ne redéfinit qu'une méthode : tout le reste est commun.</w:t>
       </w:r>
     </w:p>
     <w:p>
@@ -5907,7 +5962,7 @@
           <w:sz w:val="22"/>
           <w:szCs w:val="22"/>
         </w:rPr>
-        <w:t xml:space="preserve">L'incrément qui suit met en défaut l'abstraction construite depuis le début. Ce n'est pas un échec de conception : aucune abstraction ne prévoit tout, et le vrai savoir-faire n'est pas de deviner juste du premier coup — c'est de savoir quoi faire le jour où l'on s'est trompé.</w:t>
+        <w:t xml:space="preserve">L'incrément qui suit met en défaut l'abstraction construite depuis le début. Ce n'est pas un échec de conception : aucune abstraction ne prévoit tout, et le vrai savoir-faire n'est pas de deviner juste du premier coup — c'est de savoir quoi faire le jour où l'on s'est trompé.</w:t>
       </w:r>
     </w:p>
     <w:p>
@@ -5962,7 +6017,7 @@
           <w:sz w:val="22"/>
           <w:szCs w:val="22"/>
         </w:rPr>
-        <w:t xml:space="preserve">On veut ajouter « Devine le nombre » au catalogue. L'ordinateur tire un entier entre 1 et 100, le joueur propose des valeurs, le programme répond « plus grand » ou « plus petit ». La partie se termine quand le nombre est trouvé, ou après dix essais. C'est un jeu simple, qui tient en trente lignes.</w:t>
+        <w:t xml:space="preserve">On veut ajouter « Devine le nombre » au catalogue. L'ordinateur tire un entier entre 1 et 100, le joueur propose des valeurs, le programme répond « plus grand » ou « plus petit ». La partie se termine quand le nombre est trouvé, ou après dix essais. C'est un jeu simple, qui tient en trente lignes.</w:t>
       </w:r>
     </w:p>
     <w:p>
@@ -6129,7 +6184,7 @@
                 <w:sz w:val="20"/>
                 <w:szCs w:val="20"/>
               </w:rPr>
-              <w:t xml:space="preserve">ResultatPartie : J1 gagne, J2 gagne, match nul</w:t>
+              <w:t xml:space="preserve">ResultatPartie : J1 gagne, J2 gagne, match nul</w:t>
             </w:r>
           </w:p>
         </w:tc>
@@ -6366,7 +6421,7 @@
                 <w:sz w:val="20"/>
                 <w:szCs w:val="20"/>
               </w:rPr>
-              <w:t xml:space="preserve">la signature ment ; le prochain lecteur croira que le jeu oppose deux personnes</w:t>
+              <w:t xml:space="preserve">la signature ment ; le prochain lecteur croira que le jeu oppose deux personnes</w:t>
             </w:r>
           </w:p>
         </w:tc>
@@ -6628,7 +6683,7 @@
           <w:sz w:val="22"/>
           <w:szCs w:val="22"/>
         </w:rPr>
-        <w:t xml:space="preserve">choisissez une piste, ou inventez-en une autre ;</w:t>
+        <w:t xml:space="preserve">choisissez une piste, ou inventez-en une autre ;</w:t>
       </w:r>
     </w:p>
     <w:p>
@@ -6661,7 +6716,7 @@
           <w:sz w:val="22"/>
           <w:szCs w:val="22"/>
         </w:rPr>
-        <w:t xml:space="preserve"> et faites-le apparaître dans le catalogue ;</w:t>
+        <w:t xml:space="preserve"> et faites-le apparaître dans le catalogue ;</w:t>
       </w:r>
     </w:p>
     <w:p>
@@ -6678,7 +6733,7 @@
           <w:sz w:val="22"/>
           <w:szCs w:val="22"/>
         </w:rPr>
-        <w:t xml:space="preserve">faites en sorte que le hub le lance comme n'importe quel autre jeu ;</w:t>
+        <w:t xml:space="preserve">faites en sorte que le hub le lance comme n'importe quel autre jeu ;</w:t>
       </w:r>
     </w:p>
     <w:p>
@@ -6751,7 +6806,7 @@
                 <w:sz w:val="22"/>
                 <w:szCs w:val="22"/>
               </w:rPr>
-              <w:t xml:space="preserve">Les quatre pistes fonctionnent. Aucune n'est la bonne réponse, et c'est volontaire : à l'examen, l'objectif C.1 demande de justifier vos choix de conception, pas de retrouver ceux du professeur.</w:t>
+              <w:t xml:space="preserve">Les quatre pistes fonctionnent. Aucune n'est la bonne réponse, et c'est volontaire : à l'examen, l'objectif C.1 demande de justifier vos choix de conception, pas de retrouver ceux du professeur.</w:t>
             </w:r>
           </w:p>
           <w:p>
@@ -6800,7 +6855,7 @@
           <w:sz w:val="22"/>
           <w:szCs w:val="22"/>
         </w:rPr>
-        <w:t xml:space="preserve">La première piste est la seule qui ne touche à rien. Pourquoi est-elle pourtant la plus dangereuse à long terme ? Voir </w:t>
+        <w:t xml:space="preserve">La première piste est la seule qui ne touche à rien. Pourquoi est-elle pourtant la plus dangereuse à long terme ? Voir </w:t>
       </w:r>
       <w:r>
         <w:rPr>
@@ -6833,7 +6888,7 @@
           <w:sz w:val="22"/>
           <w:szCs w:val="22"/>
         </w:rPr>
-        <w:t xml:space="preserve">Si vous choisissez JeuSolo, GameHub devra tester le type du jeu avant de l'exécuter. N'était-ce pas précisément ce que l'interface Jeu servait à éviter ?</w:t>
+        <w:t xml:space="preserve">Si vous choisissez JeuSolo, GameHub devra tester le type du jeu avant de l'exécuter. N'était-ce pas précisément ce que l'interface Jeu servait à éviter ?</w:t>
       </w:r>
     </w:p>
     <w:p>
@@ -6850,7 +6905,7 @@
           <w:sz w:val="22"/>
           <w:szCs w:val="22"/>
         </w:rPr>
-        <w:t xml:space="preserve">Combien de jeux solitaires faudrait-il avant que votre choix devienne clairement le bon, ou clairement le mauvais ?</w:t>
+        <w:t xml:space="preserve">Combien de jeux solitaires faudrait-il avant que votre choix devienne clairement le bon, ou clairement le mauvais ?</w:t>
       </w:r>
     </w:p>
     <w:p>
@@ -6896,7 +6951,7 @@
           <w:sz w:val="22"/>
           <w:szCs w:val="22"/>
         </w:rPr>
-        <w:t xml:space="preserve">Ces deux jeux se ressemblent beaucoup : une grille rectangulaire, deux joueurs qui posent chacun leur tour, et une victoire par </w:t>
+        <w:t xml:space="preserve">Ces deux jeux se ressemblent beaucoup : une grille rectangulaire, deux joueurs qui posent chacun leur tour, et une victoire par </w:t>
       </w:r>
       <w:r>
         <w:rPr>
@@ -7215,7 +7270,7 @@
                 <w:sz w:val="20"/>
                 <w:szCs w:val="20"/>
               </w:rPr>
-              <w:t xml:space="preserve">abstraite : le tableau, l'alignement, l'affichage</w:t>
+              <w:t xml:space="preserve">abstraite : le tableau, l'alignement, l'affichage</w:t>
             </w:r>
           </w:p>
         </w:tc>
@@ -7406,7 +7461,7 @@
           <w:sz w:val="22"/>
           <w:szCs w:val="22"/>
         </w:rPr>
-        <w:t xml:space="preserve">alors qu'un seul jeu s'en sert ? Parce que le second arrive à l'incrément suivant, et qu'il posera exactement la même question : des marques alignées, dans quatre directions.</w:t>
+        <w:t xml:space="preserve">alors qu'un seul jeu s'en sert ? Parce que le second arrive à l'incrément suivant, et qu'il posera exactement la même question : des marques alignées, dans quatre directions.</w:t>
       </w:r>
     </w:p>
     <w:p>
@@ -7432,7 +7487,7 @@
           <w:sz w:val="22"/>
           <w:szCs w:val="22"/>
         </w:rPr>
-        <w:t xml:space="preserve">Ce que la classe mère ne sait pas faire : </w:t>
+        <w:t xml:space="preserve">Ce que la classe mère ne sait pas faire : </w:t>
       </w:r>
       <w:r>
         <w:rPr>
@@ -7468,7 +7523,7 @@
           <w:sz w:val="22"/>
           <w:szCs w:val="22"/>
         </w:rPr>
-        <w:t xml:space="preserve">Pour chaque case occupée, on regarde si N marques identiques se suivent dans une direction. Quatre directions suffisent :</w:t>
+        <w:t xml:space="preserve">Pour chaque case occupée, on regarde si N marques identiques se suivent dans une direction. Quatre directions suffisent :</w:t>
       </w:r>
     </w:p>
     <w:p>
@@ -7546,7 +7601,7 @@
           <w:sz w:val="22"/>
           <w:szCs w:val="22"/>
         </w:rPr>
-        <w:t xml:space="preserve">Pourquoi pas huit ? </w:t>
+        <w:t xml:space="preserve">Pourquoi pas huit ? </w:t>
       </w:r>
       <w:r>
         <w:rPr>
@@ -7587,7 +7642,7 @@
           <w:sz w:val="22"/>
           <w:szCs w:val="22"/>
         </w:rPr>
-        <w:t xml:space="preserve">La ligne 0 est en bas. Cela n'a aucune importance au morpion, et toute l'importance au puissance 4 : autant le décider maintenant.</w:t>
+        <w:t xml:space="preserve">La ligne 0 est en bas. Cela n'a aucune importance au morpion, et toute l'importance au puissance 4 : autant le décider maintenant.</w:t>
       </w:r>
     </w:p>
     <w:p>
@@ -7665,7 +7720,7 @@
           <w:sz w:val="22"/>
           <w:szCs w:val="22"/>
         </w:rPr>
-        <w:t xml:space="preserve">Trois alignés sur la ligne du bas, sur une colonne, sur chaque diagonale : quatre parties à gagner. Puis une grille pleine sans alignement, qui doit rendre un match nul.</w:t>
+        <w:t xml:space="preserve">Trois alignés sur la ligne du bas, sur une colonne, sur chaque diagonale : quatre parties à gagner. Puis une grille pleine sans alignement, qui doit rendre un match nul.</w:t>
       </w:r>
     </w:p>
     <w:p>
@@ -7734,7 +7789,7 @@
           <w:sz w:val="22"/>
           <w:szCs w:val="22"/>
         </w:rPr>
-        <w:t xml:space="preserve">Une seule méthode, en vérité : </w:t>
+        <w:t xml:space="preserve">Une seule méthode, en vérité : </w:t>
       </w:r>
       <w:r>
         <w:rPr>
@@ -7753,7 +7808,7 @@
           <w:sz w:val="22"/>
           <w:szCs w:val="22"/>
         </w:rPr>
-        <w:t xml:space="preserve">Le reste de GrillePuissance4 tient dans son constructeur : sept, six, quatre.</w:t>
+        <w:t xml:space="preserve">Le reste de GrillePuissance4 tient dans son constructeur : sept, six, quatre.</w:t>
       </w:r>
     </w:p>
     <w:p>
@@ -8193,7 +8248,7 @@
           <w:sz w:val="22"/>
           <w:szCs w:val="22"/>
         </w:rPr>
-        <w:t xml:space="preserve">. Faut-il l'extraire à son tour, dans une classe mère commune ?</w:t>
+        <w:t xml:space="preserve">. Faut-il l'extraire à son tour, dans une classe mère commune ?</w:t>
       </w:r>
     </w:p>
     <w:p>
@@ -8214,7 +8269,7 @@
           <w:sz w:val="22"/>
           <w:szCs w:val="22"/>
         </w:rPr>
-        <w:t xml:space="preserve">et il faut savoir argumenter pourquoi. Les deux boucles se ressemblent, mais elles ne demandent pas la même chose à l'utilisateur — deux nombres ici, un seul là. Une classe mère commune devrait prévoir les deux cas, donc déclarer une méthode abstraite « demander un coup », donc ajouter une abstraction pour économiser une quinzaine de lignes.</w:t>
+        <w:t xml:space="preserve">et il faut savoir argumenter pourquoi. Les deux boucles se ressemblent, mais elles ne demandent pas la même chose à l'utilisateur — deux nombres ici, un seul là. Une classe mère commune devrait prévoir les deux cas, donc déclarer une méthode abstraite « demander un coup », donc ajouter une abstraction pour économiser une quinzaine de lignes.</w:t>
       </w:r>
     </w:p>
     <w:p>
@@ -8242,7 +8297,7 @@
           <w:sz w:val="22"/>
           <w:szCs w:val="22"/>
         </w:rPr>
-        <w:t xml:space="preserve"> valait d'être supprimée : une centaine de lignes, et un algorithme où l'on se trompe. Celle-ci ne le vaut pas. Voir </w:t>
+        <w:t xml:space="preserve"> valait d'être supprimée : une centaine de lignes, et un algorithme où l'on se trompe. Celle-ci ne le vaut pas. Voir </w:t>
       </w:r>
       <w:r>
         <w:rPr>
@@ -8292,7 +8347,7 @@
           <w:sz w:val="22"/>
           <w:szCs w:val="22"/>
         </w:rPr>
-        <w:t xml:space="preserve">Une marque lâchée dans une colonne vide se pose en bas ; la suivante juste au-dessus.</w:t>
+        <w:t xml:space="preserve">Une marque lâchée dans une colonne vide se pose en bas ; la suivante juste au-dessus.</w:t>
       </w:r>
     </w:p>
     <w:p>
@@ -8309,7 +8364,7 @@
           <w:sz w:val="22"/>
           <w:szCs w:val="22"/>
         </w:rPr>
-        <w:t xml:space="preserve">Quatre alignées horizontalement, verticalement et en diagonale font gagner ; trois ne font rien.</w:t>
+        <w:t xml:space="preserve">Quatre alignées horizontalement, verticalement et en diagonale font gagner ; trois ne font rien.</w:t>
       </w:r>
     </w:p>
     <w:p>
@@ -8371,7 +8426,7 @@
           <w:sz w:val="22"/>
           <w:szCs w:val="22"/>
         </w:rPr>
-        <w:t xml:space="preserve"> qui levait une exception n'a plus rien à absorber : toutes les valeurs de TypeJeu ont maintenant leur jeu. Laissez-le — il coûte une ligne, et il protège le jour où une valeur s'ajoutera.</w:t>
+        <w:t xml:space="preserve"> qui levait une exception n'a plus rien à absorber : toutes les valeurs de TypeJeu ont maintenant leur jeu. Laissez-le — il coûte une ligne, et il protège le jour où une valeur s'ajoutera.</w:t>
       </w:r>
     </w:p>
     <w:p>
@@ -8467,7 +8522,7 @@
           <w:sz w:val="22"/>
           <w:szCs w:val="22"/>
         </w:rPr>
-        <w:t xml:space="preserve">Deux incréments courts, qui ne font apparaître aucun jeu. Ils reprennent du code écrit depuis longtemps avec deux outils neufs : la généricité, puis les lambdas.</w:t>
+        <w:t xml:space="preserve">Deux incréments courts, qui ne font apparaître aucun jeu. Ils reprennent du code écrit depuis longtemps avec deux outils neufs : la généricité, puis les lambdas.</w:t>
       </w:r>
     </w:p>
     <w:p>
@@ -8889,7 +8944,7 @@
           <w:sz w:val="22"/>
           <w:szCs w:val="22"/>
         </w:rPr>
-        <w:t xml:space="preserve"> : un champ </w:t>
+        <w:t xml:space="preserve"> : un champ </w:t>
       </w:r>
       <w:r>
         <w:rPr>
@@ -8966,7 +9021,7 @@
           <w:sz w:val="22"/>
           <w:szCs w:val="22"/>
         </w:rPr>
-        <w:t xml:space="preserve">Le Nim se joue exactement comme avant : mêmes stratégies, mêmes coups, mêmes résultats. Un incrément qui ne change pas le comportement se vérifie en comparant deux parties.</w:t>
+        <w:t xml:space="preserve">Le Nim se joue exactement comme avant : mêmes stratégies, mêmes coups, mêmes résultats. Un incrément qui ne change pas le comportement se vérifie en comparant deux parties.</w:t>
       </w:r>
     </w:p>
     <w:p>
@@ -9032,7 +9087,7 @@
           <w:sz w:val="22"/>
           <w:szCs w:val="22"/>
         </w:rPr>
-        <w:t xml:space="preserve"> de plus ? Voir </w:t>
+        <w:t xml:space="preserve"> de plus ? Voir </w:t>
       </w:r>
       <w:r>
         <w:rPr>
@@ -9065,7 +9120,7 @@
           <w:sz w:val="22"/>
           <w:szCs w:val="22"/>
         </w:rPr>
-        <w:t xml:space="preserve">La même classe sert pour des stratégies et pour des joueurs, sans un seul transtypage. Combien de classes aurait-il fallu sans la généricité ?</w:t>
+        <w:t xml:space="preserve">La même classe sert pour des stratégies et pour des joueurs, sans un seul transtypage. Combien de classes aurait-il fallu sans la généricité ?</w:t>
       </w:r>
     </w:p>
     <w:p>
@@ -9082,7 +9137,7 @@
           <w:sz w:val="22"/>
           <w:szCs w:val="22"/>
         </w:rPr>
-        <w:t xml:space="preserve">La bataille passe ses deux pioches en paramètres jumeaux à plusieurs méthodes. Faut-il y introduire ParJoueur aussi ? Dites ce que cela coûterait, et ce que cela rapporterait, avant de décider.</w:t>
+        <w:t xml:space="preserve">La bataille passe ses deux pioches en paramètres jumeaux à plusieurs méthodes. Faut-il y introduire ParJoueur aussi ? Dites ce que cela coûterait, et ce que cela rapporterait, avant de décider.</w:t>
       </w:r>
     </w:p>
     <w:p>
@@ -9169,7 +9224,7 @@
           <w:sz w:val="22"/>
           <w:szCs w:val="22"/>
         </w:rPr>
-        <w:t xml:space="preserve"> associe chaque type de jeu à la façon d'en fabriquer un. Ajouter un jeu, c'est ajouter un cas, et un cas n'est rien d'autre qu'une association : ce type, ce constructeur.</w:t>
+        <w:t xml:space="preserve"> associe chaque type de jeu à la façon d'en fabriquer un. Ajouter un jeu, c'est ajouter un cas, et un cas n'est rien d'autre qu'une association : ce type, ce constructeur.</w:t>
       </w:r>
     </w:p>
     <w:p>
@@ -9290,7 +9345,7 @@
           <w:sz w:val="22"/>
           <w:szCs w:val="22"/>
         </w:rPr>
-        <w:t xml:space="preserve">Une référence de constructeur suffit pour un jeu sans paramètre ; le Nim, qui en a deux, demande une lambda. Les deux sont des </w:t>
+        <w:t xml:space="preserve">Une référence de constructeur suffit pour un jeu sans paramètre ; le Nim, qui en a deux, demande une lambda. Les deux sont des </w:t>
       </w:r>
       <w:r>
         <w:rPr>
@@ -9369,7 +9424,7 @@
           <w:sz w:val="22"/>
           <w:szCs w:val="22"/>
         </w:rPr>
-        <w:t xml:space="preserve">Pourquoi ranger la façon de fabriquer un jeu, et pas le jeu lui-même ? Pensez à ce qui arriverait à la deuxième partie de Nim, une fois le premier jeu configuré.</w:t>
+        <w:t xml:space="preserve">Pourquoi ranger la façon de fabriquer un jeu, et pas le jeu lui-même ? Pensez à ce qui arriverait à la deuxième partie de Nim, une fois le premier jeu configuré.</w:t>
       </w:r>
     </w:p>
     <w:p>
@@ -9402,7 +9457,7 @@
           <w:sz w:val="22"/>
           <w:szCs w:val="22"/>
         </w:rPr>
-        <w:t xml:space="preserve"> du switch protégeait contre une valeur sans jeu. Qu'est-ce qui la protège maintenant ?</w:t>
+        <w:t xml:space="preserve"> du switch protégeait contre une valeur sans jeu. Qu'est-ce qui la protège maintenant ?</w:t>
       </w:r>
     </w:p>
     <w:p>
@@ -9435,7 +9490,7 @@
           <w:sz w:val="22"/>
           <w:szCs w:val="22"/>
         </w:rPr>
-        <w:t xml:space="preserve"> vous promettait le thème LAM : </w:t>
+        <w:t xml:space="preserve"> vous promettait le thème LAM : </w:t>
       </w:r>
       <w:r>
         <w:rPr>
@@ -9467,7 +9522,7 @@
           <w:sz w:val="22"/>
           <w:szCs w:val="22"/>
         </w:rPr>
-        <w:t xml:space="preserve"> en une lambda. Où pourrait-elle vivre, maintenant que vous savez ranger des comportements dans une Map ?</w:t>
+        <w:t xml:space="preserve"> en une lambda. Où pourrait-elle vivre, maintenant que vous savez ranger des comportements dans une Map ?</w:t>
       </w:r>
     </w:p>
     <w:p>
@@ -9501,7 +9556,7 @@
           <w:sz w:val="22"/>
           <w:szCs w:val="22"/>
         </w:rPr>
-        <w:t xml:space="preserve">GameHub est une application console. Ouvrir une fenêtre depuis son menu obligerait à démarrer JavaFX à la main, sur un autre fil d'exécution : trois notions hors programme pour un seul jeu. La fenêtre est donc une </w:t>
+        <w:t xml:space="preserve">GameHub est une application console. Ouvrir une fenêtre depuis son menu obligerait à démarrer JavaFX à la main, sur un autre fil d'exécution : trois notions hors programme pour un seul jeu. La fenêtre est donc une </w:t>
       </w:r>
       <w:r>
         <w:rPr>
@@ -9695,7 +9750,7 @@
           <w:sz w:val="22"/>
           <w:szCs w:val="22"/>
         </w:rPr>
-        <w:t xml:space="preserve">Une partie contre la machine. Vous commencez, à quatorze allumettes ; la machine joue la stratégie maligne. Celui qui prend la dernière a perdu.</w:t>
+        <w:t xml:space="preserve">Une partie contre la machine. Vous commencez, à quatorze allumettes ; la machine joue la stratégie maligne. Celui qui prend la dernière a perdu.</w:t>
       </w:r>
     </w:p>
     <w:tbl>
@@ -9847,7 +9902,7 @@
                 <w:sz w:val="18"/>
                 <w:szCs w:val="18"/>
               </w:rPr>
-              <w:t xml:space="preserve">trois Button « Prendre 1 » à « Prendre 3 »</w:t>
+              <w:t xml:space="preserve">trois Button « Prendre 1 » à « Prendre 3 »</w:t>
             </w:r>
           </w:p>
         </w:tc>
@@ -9870,7 +9925,7 @@
                 <w:sz w:val="20"/>
                 <w:szCs w:val="20"/>
               </w:rPr>
-              <w:t xml:space="preserve">votre coup ; un par retrait permis par les règles</w:t>
+              <w:t xml:space="preserve">votre coup ; un par retrait permis par les règles</w:t>
             </w:r>
           </w:p>
         </w:tc>
@@ -10015,7 +10070,7 @@
           <w:sz w:val="22"/>
           <w:szCs w:val="22"/>
         </w:rPr>
-        <w:t xml:space="preserve">Pile, ReglesNim et les stratégies sont reprises telles quelles : elles ne savaient rien de la console, elles ne savent rien de la fenêtre.</w:t>
+        <w:t xml:space="preserve">Pile, ReglesNim et les stratégies sont reprises telles quelles : elles ne savaient rien de la console, elles ne savent rien de la fenêtre.</w:t>
       </w:r>
     </w:p>
     <w:p>
@@ -10059,7 +10114,7 @@
           <w:sz w:val="22"/>
           <w:szCs w:val="22"/>
         </w:rPr>
-        <w:t xml:space="preserve"> est une boucle qui va jusqu'au bout de la partie sans jamais s'arrêter. Une fenêtre ne peut pas l'attendre : elle doit jouer un tour à chaque clic, puis rendre la main.</w:t>
+        <w:t xml:space="preserve"> est une boucle qui va jusqu'au bout de la partie sans jamais s'arrêter. Une fenêtre ne peut pas l'attendre : elle doit jouer un tour à chaque clic, puis rendre la main.</w:t>
       </w:r>
     </w:p>
     <w:p>
@@ -10088,7 +10143,7 @@
           <w:sz w:val="22"/>
           <w:szCs w:val="22"/>
         </w:rPr>
-        <w:t xml:space="preserve">Un clic du joueur fait tout un tour : son coup, puis, si la partie continue, celui de la machine. Écrivez-le dans une méthode, et faites-la appeler par les boutons </w:t>
+        <w:t xml:space="preserve">Un clic du joueur fait tout un tour : son coup, puis, si la partie continue, celui de la machine. Écrivez-le dans une méthode, et faites-la appeler par les boutons </w:t>
       </w:r>
       <w:r>
         <w:rPr>
@@ -10132,7 +10187,7 @@
           <w:sz w:val="22"/>
           <w:szCs w:val="22"/>
         </w:rPr>
-        <w:t xml:space="preserve">, ne faites pas confiance à la stratégie de la machine : vérifiez son coup auprès des règles. Et prévoyez un seul endroit, une méthode, où l'écran apprend que la pile a changé. L'incrément suivant en aura besoin.</w:t>
+        <w:t xml:space="preserve">, ne faites pas confiance à la stratégie de la machine : vérifiez son coup auprès des règles. Et prévoyez un seul endroit, une méthode, où l'écran apprend que la pile a changé. L'incrément suivant en aura besoin.</w:t>
       </w:r>
     </w:p>
     <w:p>
@@ -10166,7 +10221,7 @@
           <w:sz w:val="22"/>
           <w:szCs w:val="22"/>
         </w:rPr>
-        <w:t xml:space="preserve">la fenêtre s'ouvre sur « 14 allumettes » ;</w:t>
+        <w:t xml:space="preserve">la fenêtre s'ouvre sur « 14 allumettes » ;</w:t>
       </w:r>
     </w:p>
     <w:p>
@@ -10183,7 +10238,7 @@
           <w:sz w:val="22"/>
           <w:szCs w:val="22"/>
         </w:rPr>
-        <w:t xml:space="preserve">chaque clic ou chaque touche retire vos allumettes, puis la machine joue et annonce son coup ;</w:t>
+        <w:t xml:space="preserve">chaque clic ou chaque touche retire vos allumettes, puis la machine joue et annonce son coup ;</w:t>
       </w:r>
     </w:p>
     <w:p>
@@ -10200,7 +10255,7 @@
           <w:sz w:val="22"/>
           <w:szCs w:val="22"/>
         </w:rPr>
-        <w:t xml:space="preserve">un coup impossible, trois allumettes quand il en reste deux, est refusé avec un message, sans planter ;</w:t>
+        <w:t xml:space="preserve">un coup impossible, trois allumettes quand il en reste deux, est refusé avec un message, sans planter ;</w:t>
       </w:r>
     </w:p>
     <w:p>
@@ -10251,7 +10306,7 @@
           <w:sz w:val="22"/>
           <w:szCs w:val="22"/>
         </w:rPr>
-        <w:t xml:space="preserve">La boucle while de JeuNim n'apparaît nulle part dans votre code. Où est-elle passée ?</w:t>
+        <w:t xml:space="preserve">La boucle while de JeuNim n'apparaît nulle part dans votre code. Où est-elle passée ?</w:t>
       </w:r>
     </w:p>
     <w:p>
@@ -10268,7 +10323,7 @@
           <w:sz w:val="22"/>
           <w:szCs w:val="22"/>
         </w:rPr>
-        <w:t xml:space="preserve">Pourquoi les stratégies se réutilisent-elles sans une ligne changée, alors que JeuNim ne se réutilise pas du tout ?</w:t>
+        <w:t xml:space="preserve">Pourquoi les stratégies se réutilisent-elles sans une ligne changée, alors que JeuNim ne se réutilise pas du tout ?</w:t>
       </w:r>
     </w:p>
     <w:p>
@@ -10285,7 +10340,7 @@
           <w:sz w:val="22"/>
           <w:szCs w:val="22"/>
         </w:rPr>
-        <w:t xml:space="preserve">Les boutons qui prendraient plus d'allumettes qu'il n'en reste devraient être grisés. Où écririez-vous cette règle, et combien de fois ?</w:t>
+        <w:t xml:space="preserve">Les boutons qui prendraient plus d'allumettes qu'il n'en reste devraient être grisés. Où écririez-vous cette règle, et combien de fois ?</w:t>
       </w:r>
     </w:p>
     <w:p>
@@ -10323,7 +10378,7 @@
           <w:sz w:val="22"/>
           <w:szCs w:val="22"/>
         </w:rPr>
-        <w:t xml:space="preserve">La réponse à la dernière question : une fois par bouton, et dans aucun gestionnaire.</w:t>
+        <w:t xml:space="preserve">La réponse à la dernière question : une fois par bouton, et dans aucun gestionnaire.</w:t>
       </w:r>
     </w:p>
     <w:p>
@@ -10368,7 +10423,7 @@
           <w:sz w:val="22"/>
           <w:szCs w:val="22"/>
         </w:rPr>
-        <w:t xml:space="preserve"> qui suit le nombre d'allumettes restantes. La méthode où l'écran apprenait que la pile avait changé ne met plus à jour le libellé : elle met à jour la propriété.</w:t>
+        <w:t xml:space="preserve"> qui suit le nombre d'allumettes restantes. La méthode où l'écran apprenait que la pile avait changé ne met plus à jour le libellé : elle met à jour la propriété.</w:t>
       </w:r>
     </w:p>
     <w:p>
@@ -10396,7 +10451,7 @@
           <w:sz w:val="22"/>
           <w:szCs w:val="22"/>
         </w:rPr>
-        <w:t xml:space="preserve">. Et la désactivation de chaque bouton, par une seule instruction : celui qui prend </w:t>
+        <w:t xml:space="preserve">. Et la désactivation de chaque bouton, par une seule instruction : celui qui prend </w:t>
       </w:r>
       <w:r>
         <w:rPr>
@@ -10478,7 +10533,7 @@
           <w:sz w:val="22"/>
           <w:szCs w:val="22"/>
         </w:rPr>
-        <w:t xml:space="preserve">le libellé affiche le bon nombre dès l'ouverture, sans ligne pour l'initialiser ;</w:t>
+        <w:t xml:space="preserve">le libellé affiche le bon nombre dès l'ouverture, sans ligne pour l'initialiser ;</w:t>
       </w:r>
     </w:p>
     <w:p>
@@ -10495,7 +10550,7 @@
           <w:sz w:val="22"/>
           <w:szCs w:val="22"/>
         </w:rPr>
-        <w:t xml:space="preserve">à deux allumettes restantes, « Prendre 3 » est grisé ; à une, « Prendre 2 » aussi ;</w:t>
+        <w:t xml:space="preserve">à deux allumettes restantes, « Prendre 3 » est grisé ; à une, « Prendre 2 » aussi ;</w:t>
       </w:r>
     </w:p>
     <w:p>
@@ -10512,7 +10567,7 @@
           <w:sz w:val="22"/>
           <w:szCs w:val="22"/>
         </w:rPr>
-        <w:t xml:space="preserve">à la fin de la partie, les trois boutons sont grisés ;</w:t>
+        <w:t xml:space="preserve">à la fin de la partie, les trois boutons sont grisés ;</w:t>
       </w:r>
     </w:p>
     <w:p>
@@ -10563,7 +10618,7 @@
           <w:sz w:val="22"/>
           <w:szCs w:val="22"/>
         </w:rPr>
-        <w:t xml:space="preserve">Pourquoi tous les boutons sont-ils grisés à la fin, alors que vous n'avez écrit aucune condition « partie finie » ?</w:t>
+        <w:t xml:space="preserve">Pourquoi tous les boutons sont-ils grisés à la fin, alors que vous n'avez écrit aucune condition « partie finie » ?</w:t>
       </w:r>
     </w:p>
     <w:p>
@@ -10580,7 +10635,7 @@
           <w:sz w:val="22"/>
           <w:szCs w:val="22"/>
         </w:rPr>
-        <w:t xml:space="preserve">La propriété vit dans la fenêtre, pas dans Pile. Qu'aurait-on gagné, et perdu, à la mettre dans Pile ?</w:t>
+        <w:t xml:space="preserve">La propriété vit dans la fenêtre, pas dans Pile. Qu'aurait-on gagné, et perdu, à la mettre dans Pile ?</w:t>
       </w:r>
     </w:p>
     <w:p>
@@ -10597,7 +10652,7 @@
           <w:sz w:val="22"/>
           <w:szCs w:val="22"/>
         </w:rPr>
-        <w:t xml:space="preserve">Les touches 1, 2 et 3 ignorent les boutons grisés. Votre programme reste-t-il juste ? Qu'est-ce qui le protège ?</w:t>
+        <w:t xml:space="preserve">Les touches 1, 2 et 3 ignorent les boutons grisés. Votre programme reste-t-il juste ? Qu'est-ce qui le protège ?</w:t>
       </w:r>
     </w:p>
     <w:p>
@@ -10690,7 +10745,7 @@
           <w:sz w:val="22"/>
           <w:szCs w:val="22"/>
         </w:rPr>
-        <w:t xml:space="preserve">, GameHub a un journal. Mais il ne garde rien : il compte les coups d'une partie et les annonce sur la console. Et le hub ne joue qu'une partie par lancement. Quand le programme s'arrête, tout ce qu'il savait disparaît.</w:t>
+        <w:t xml:space="preserve">, GameHub a un journal. Mais il ne garde rien : il compte les coups d'une partie et les annonce sur la console. Et le hub ne joue qu'une partie par lancement. Quand le programme s'arrête, tout ce qu'il savait disparaît.</w:t>
       </w:r>
     </w:p>
     <w:p>
@@ -10858,7 +10913,7 @@
                 <w:sz w:val="20"/>
                 <w:szCs w:val="20"/>
               </w:rPr>
-              <w:t xml:space="preserve">« parties.txt » par défaut ; un second constructeur en accepte un autre</w:t>
+              <w:t xml:space="preserve">« parties.txt » par défaut ; un second constructeur en accepte un autre</w:t>
             </w:r>
           </w:p>
         </w:tc>
@@ -10994,7 +11049,7 @@
           <w:sz w:val="22"/>
           <w:szCs w:val="22"/>
         </w:rPr>
-        <w:t xml:space="preserve">Une ligne par partie, quatre champs séparés par un point-virgule : le type, le gagnant, le début, la fin. Écrivez le type par son </w:t>
+        <w:t xml:space="preserve">Une ligne par partie, quatre champs séparés par un point-virgule : le type, le gagnant, le début, la fin. Écrivez le type par son </w:t>
       </w:r>
       <w:r>
         <w:rPr>
@@ -11026,7 +11081,7 @@
           <w:sz w:val="22"/>
           <w:szCs w:val="22"/>
         </w:rPr>
-        <w:t xml:space="preserve">, et non par son libellé : c'est le nom que </w:t>
+        <w:t xml:space="preserve">, et non par son libellé : c'est le nom que </w:t>
       </w:r>
       <w:r>
         <w:rPr>
@@ -11135,7 +11190,7 @@
           <w:sz w:val="22"/>
           <w:szCs w:val="22"/>
         </w:rPr>
-        <w:t xml:space="preserve"> : chaque partie s'ajoute aux précédentes, elle ne les remplace pas. Et fermez-le quoi qu'il arrive, par un </w:t>
+        <w:t xml:space="preserve"> : chaque partie s'ajoute aux précédentes, elle ne les remplace pas. Et fermez-le quoi qu'il arrive, par un </w:t>
       </w:r>
       <w:r>
         <w:rPr>
@@ -11163,7 +11218,7 @@
           <w:sz w:val="22"/>
           <w:szCs w:val="22"/>
         </w:rPr>
-        <w:t xml:space="preserve">Une erreur d'écriture ne doit pas faire perdre la partie qu'on vient de jouer : signalez-la, et laissez le hub continuer. Au tout premier lancement, le fichier n'existe pas encore, et l'historique est simplement vide. Voir </w:t>
+        <w:t xml:space="preserve">Une erreur d'écriture ne doit pas faire perdre la partie qu'on vient de jouer : signalez-la, et laissez le hub continuer. Au tout premier lancement, le fichier n'existe pas encore, et l'historique est simplement vide. Voir </w:t>
       </w:r>
       <w:r>
         <w:rPr>
@@ -11213,7 +11268,7 @@
           <w:sz w:val="22"/>
           <w:szCs w:val="22"/>
         </w:rPr>
-        <w:t xml:space="preserve">au premier lancement, GameHub annonce qu'aucune partie n'a été jouée ;</w:t>
+        <w:t xml:space="preserve">au premier lancement, GameHub annonce qu'aucune partie n'a été jouée ;</w:t>
       </w:r>
     </w:p>
     <w:p>
@@ -11230,7 +11285,7 @@
           <w:sz w:val="22"/>
           <w:szCs w:val="22"/>
         </w:rPr>
-        <w:t xml:space="preserve">après deux parties, deux lancements, le troisième les affiche toutes les deux, dans l'ordre ;</w:t>
+        <w:t xml:space="preserve">après deux parties, deux lancements, le troisième les affiche toutes les deux, dans l'ordre ;</w:t>
       </w:r>
     </w:p>
     <w:p>
@@ -11281,7 +11336,7 @@
           <w:sz w:val="22"/>
           <w:szCs w:val="22"/>
         </w:rPr>
-        <w:t xml:space="preserve">Que se passe-t-il si un joueur choisit un pseudo qui contient un point-virgule ? Comment s'en protéger ?</w:t>
+        <w:t xml:space="preserve">Que se passe-t-il si un joueur choisit un pseudo qui contient un point-virgule ? Comment s'en protéger ?</w:t>
       </w:r>
     </w:p>
     <w:p>
@@ -11298,7 +11353,7 @@
           <w:sz w:val="22"/>
           <w:szCs w:val="22"/>
         </w:rPr>
-        <w:t xml:space="preserve">Une ligne abîmée, coupée en plein milieu ou modifiée à la main, fait-elle échouer tout l'historique ? Faut-il l'ignorer, ou s'arrêter ?</w:t>
+        <w:t xml:space="preserve">Une ligne abîmée, coupée en plein milieu ou modifiée à la main, fait-elle échouer tout l'historique ? Faut-il l'ignorer, ou s'arrêter ?</w:t>
       </w:r>
     </w:p>
     <w:p>
@@ -11315,7 +11370,7 @@
           <w:sz w:val="22"/>
           <w:szCs w:val="22"/>
         </w:rPr>
-        <w:t xml:space="preserve">Le thème FIC montre aussi les flux d'objets. Auriez-vous pu écrire la liste des résumés d'un coup ? Qu'auriez-vous perdu ?</w:t>
+        <w:t xml:space="preserve">Le thème FIC montre aussi les flux d'objets. Auriez-vous pu écrire la liste des résumés d'un coup ? Qu'auriez-vous perdu ?</w:t>
       </w:r>
     </w:p>
     <w:p>
@@ -11349,7 +11404,7 @@
           <w:sz w:val="22"/>
           <w:szCs w:val="22"/>
         </w:rPr>
-        <w:t xml:space="preserve">Au terme du fil rouge, huit packages. Les flèches se lisent « dépend de » : remarquez qu'aucune ne remonte vers le hub, et qu'aucun package de jeu n'en connaît un autre.</w:t>
+        <w:t xml:space="preserve">Au terme du fil rouge, huit packages. Les flèches se lisent « dépend de » : remarquez qu'aucune ne remonte vers le hub, et qu'aucun package de jeu n'en connaît un autre.</w:t>
       </w:r>
     </w:p>
     <w:p>
@@ -11423,14 +11478,13 @@
           <w:sz w:val="22"/>
           <w:szCs w:val="22"/>
         </w:rPr>
-        <w:t xml:space="preserve">C'est le résultat de trente-cinq incréments, et la seule chose qu'il faut en retenir : une dépendance qu'on n'a pas créée est une dépendance qu'on n'aura pas à défaire.</w:t>
+        <w:t xml:space="preserve">C'est le résultat de trente-cinq incréments, et la seule chose qu'il faut en retenir : une dépendance qu'on n'a pas créée est une dépendance qu'on n'aura pas à défaire.</w:t>
       </w:r>
     </w:p>
     <w:sectPr>
-      <w:footerReference w:type="default" r:id="rId17"/>
       <w:pgSz w:w="11906" w:h="16838" w:orient="portrait"/>
       <w:pgMar w:top="1440" w:right="1440" w:bottom="1440" w:left="1440" w:header="708" w:footer="708" w:gutter="0"/>
-      <w:pgNumType w:start="1"/>
+      <w:pgNumType/>
       <w:docGrid w:linePitch="360"/>
     </w:sectPr>
   </w:body>
@@ -11476,67 +11530,6 @@
     </w:p>
   </w:endnote>
 </w:endnotes>
-</file>
-
-<file path=word/footer1.xml><?xml version="1.0" encoding="utf-8"?>
-<w:ftr xmlns:w="http://schemas.openxmlformats.org/wordprocessingml/2006/main">
-  <w:p>
-    <w:pPr>
-      <w:jc w:val="center"/>
-      <w:rPr>
-        <w:sz w:val="18"/>
-        <w:szCs w:val="18"/>
-        <w:color w:val="595959"/>
-      </w:rPr>
-    </w:pPr>
-    <w:r>
-      <w:rPr>
-        <w:sz w:val="18"/>
-        <w:szCs w:val="18"/>
-        <w:color w:val="595959"/>
-      </w:rPr>
-      <w:t xml:space="preserve">GameHub </w:t>
-    </w:r>
-    <w:r>
-      <w:fldChar w:fldCharType="begin"/>
-    </w:r>
-    <w:r>
-      <w:instrText xml:space="preserve"> PAGE </w:instrText>
-    </w:r>
-    <w:r>
-      <w:fldChar w:fldCharType="separate"/>
-    </w:r>
-    <w:r>
-      <w:t>1</w:t>
-    </w:r>
-    <w:r>
-      <w:fldChar w:fldCharType="end"/>
-    </w:r>
-    <w:r>
-      <w:rPr>
-        <w:sz w:val="18"/>
-        <w:szCs w:val="18"/>
-        <w:color w:val="595959"/>
-      </w:rPr>
-      <w:t xml:space="preserve"> / </w:t>
-    </w:r>
-    <w:r>
-      <w:fldChar w:fldCharType="begin"/>
-    </w:r>
-    <w:r>
-      <w:instrText xml:space="preserve"> SECTIONPAGES </w:instrText>
-    </w:r>
-    <w:r>
-      <w:fldChar w:fldCharType="separate"/>
-    </w:r>
-    <w:r>
-      <w:t>23</w:t>
-    </w:r>
-    <w:r>
-      <w:fldChar w:fldCharType="end"/>
-    </w:r>
-  </w:p>
-</w:ftr>
 </file>
 
 <file path=word/footnotes.xml><?xml version="1.0" encoding="utf-8"?>

</xml_diff>